<commit_message>
Highlighted the company name on all of the word documents
</commit_message>
<xml_diff>
--- a/public/templates/MBCDI report English 16-30mo_TYPICAL.docx
+++ b/public/templates/MBCDI report English 16-30mo_TYPICAL.docx
@@ -53,6 +53,7 @@
         </w:rPr>
         <w:t xml:space="preserve">Thank you for being part of the </w:t>
       </w:r>
+      <w:proofErr w:type="gramStart"/>
       <w:r>
         <w:rPr>
           <w:rFonts w:cs="Times New Roman"/>
@@ -60,9 +61,11 @@
           <w:iCs/>
           <w:sz w:val="22"/>
           <w:szCs w:val="22"/>
+          <w:highlight w:val="yellow"/>
         </w:rPr>
         <w:t>[ ]</w:t>
       </w:r>
+      <w:proofErr w:type="gramEnd"/>
       <w:r>
         <w:rPr>
           <w:rFonts w:cs="Times New Roman"/>
@@ -418,8 +421,9 @@
           <w:sz w:val="22"/>
           <w:szCs w:val="22"/>
         </w:rPr>
-        <w:t>What Does the 2</w:t>
-      </w:r>
+        <w:t xml:space="preserve">What Does </w:t>
+      </w:r>
+      <w:proofErr w:type="gramStart"/>
       <w:r>
         <w:rPr>
           <w:rFonts w:cs="Times New Roman"/>
@@ -428,7 +432,7 @@
           <w:sz w:val="22"/>
           <w:szCs w:val="22"/>
         </w:rPr>
-        <w:t>0</w:t>
+        <w:t>the 2</w:t>
       </w:r>
       <w:r>
         <w:rPr>
@@ -438,6 +442,17 @@
           <w:sz w:val="22"/>
           <w:szCs w:val="22"/>
         </w:rPr>
+        <w:t>0</w:t>
+      </w:r>
+      <w:proofErr w:type="gramEnd"/>
+      <w:r>
+        <w:rPr>
+          <w:rFonts w:cs="Times New Roman"/>
+          <w:b/>
+          <w:bCs/>
+          <w:sz w:val="22"/>
+          <w:szCs w:val="22"/>
+        </w:rPr>
         <w:t xml:space="preserve">% Threshold Mean? </w:t>
       </w:r>
       <w:r>
@@ -510,7 +525,25 @@
           <w:sz w:val="22"/>
           <w:szCs w:val="22"/>
         </w:rPr>
-        <w:t>% threshold on all key measures, meaning there is every indication that your child is learning language at a rate that is typical of their age-mates.</w:t>
+        <w:t xml:space="preserve">% threshold on all key measures, meaning there is every indication that your child is learning language at a rate that is typical of their </w:t>
+      </w:r>
+      <w:proofErr w:type="gramStart"/>
+      <w:r>
+        <w:rPr>
+          <w:rFonts w:cs="Times New Roman"/>
+          <w:sz w:val="22"/>
+          <w:szCs w:val="22"/>
+        </w:rPr>
+        <w:t>age-mates</w:t>
+      </w:r>
+      <w:proofErr w:type="gramEnd"/>
+      <w:r>
+        <w:rPr>
+          <w:rFonts w:cs="Times New Roman"/>
+          <w:sz w:val="22"/>
+          <w:szCs w:val="22"/>
+        </w:rPr>
+        <w:t>.</w:t>
       </w:r>
     </w:p>
     <w:p>

</xml_diff>